<commit_message>
Calculate weeks_detected from Rapid7 vulnerability 'added' date instead of hardcoding 1
Made-with: Cursor
</commit_message>
<xml_diff>
--- a/reports/CTI_Weekly_Report_2026-04-25.docx
+++ b/reports/CTI_Weekly_Report_2026-04-25.docx
@@ -70,7 +70,7 @@
           <w:color w:val="333333"/>
           <w:sz w:val="21"/>
         </w:rPr>
-        <w:t>This week's threat intelligence analysis reveals a wide array of vulnerabilities detected across our environment, including several with high and critical severity ratings. While none of the CVEs detected are currently flagged as actively exploited, the presence of vulnerabilities affecting multiple systems increases the risk of compromise, especially for research data, laboratory equipment, and healthcare systems. Notably, CVE-2023-33999 and CVE-2022-23975 are present on seven systems each, elevating their priority due to the potential for lateral movement and broader impact. The exposure of older vulnerabilities, such as CVE-2012-4272 and CVE-2017-14622, also raises concerns about legacy systems and supply chain risk, which could be targeted by opportunistic or state-sponsored actors seeking access to intellectual property or patient data.   CrowdStrike APT activity highlights ongoing targeting of manufacturing, healthcare, and biotech sectors by both criminal and state-sponsored groups, including actors from Russia, China, Iran, and North Korea. OSINT sources report an uptick in AI-powered phishing, extortion, and malware campaigns, with new threat groups leveraging social engineering and persistent malware to compromise critical infrastructure. These trends underscore the need for rapid patching, enhanced monitoring, and supply chain vigilance to maintain regulatory compliance and protect sensitive assets.   Immediate attention should be given to vulnerabilities with wide exposure and those affecting systems integral to laboratory operations, healthcare workflows, and data management. Proactive threat hunting and monitoring for indicators associated with prominent APT groups and underground activity reported by Intel471 are recommended to mitigate the risk of data theft, ransomware, and regulatory violations.</w:t>
+        <w:t>This week's threat intelligence analysis reveals several high-priority vulnerabilities and persistent threat actor activity targeting sectors critical to genomics, biotech, and manufacturing. The most urgent risks stem from vulnerabilities detected on multiple systems, including CVE-2023-33999, CVE-2021-39317, and CVE-2022-23975, each present on seven systems. These vulnerabilities, if exploited, could result in unauthorized access to research data, disruption of laboratory equipment, and compromise of healthcare systems. While none of the detected CVEs are currently flagged as actively exploited, their presence across multiple assets increases the risk of lateral movement and data exfiltration, especially in environments handling sensitive intellectual property and patient information. Several threat actors tracked by CrowdStrike, such as VICE SPIDER, TRAVELING SPIDER, and HOOK SPIDER, continue to target manufacturing, healthcare, and biotech sectors with criminal motivations. Their tactics include ransomware, extortion, and supply chain compromise, which align with recent OSINT reports of increased vishing attacks and persistent malware in critical infrastructure devices. The convergence of these vulnerabilities and threat actor activity underscores the need for immediate patching of high-exposure CVEs, enhanced monitoring for suspicious network activity, and strict supply chain security controls. Regulatory compliance risks (HIPAA, FDA) are heightened by vulnerabilities affecting systems that may store or process patient data, making timely remediation essential to avoid legal and reputational consequences.</w:t>
       </w:r>
     </w:p>
     <w:p>
@@ -441,7 +441,7 @@
                 <w:color w:val="FF3B3B"/>
                 <w:sz w:val="44"/>
               </w:rPr>
-              <w:t>5</w:t>
+              <w:t>3</w:t>
             </w:r>
           </w:p>
           <w:p>
@@ -804,6 +804,7 @@
         <w:tc>
           <w:tcPr>
             <w:tcW w:type="dxa" w:w="1680"/>
+            <w:shd w:fill="FFEBEE" w:val="clear" w:color="auto"/>
             <w:tcBorders>
               <w:top w:val="single" w:sz="4" w:space="0" w:color="CCCCCC"/>
               <w:bottom w:val="single" w:sz="4" w:space="0" w:color="CCCCCC"/>
@@ -820,7 +821,7 @@
                 <w:color w:val="333333"/>
                 <w:sz w:val="18"/>
               </w:rPr>
-              <w:t>New</w:t>
+              <w:t>49</w:t>
             </w:r>
           </w:p>
         </w:tc>
@@ -935,6 +936,7 @@
         <w:tc>
           <w:tcPr>
             <w:tcW w:type="dxa" w:w="1680"/>
+            <w:shd w:fill="FFEBEE" w:val="clear" w:color="auto"/>
             <w:tcBorders>
               <w:top w:val="single" w:sz="4" w:space="0" w:color="CCCCCC"/>
               <w:bottom w:val="single" w:sz="4" w:space="0" w:color="CCCCCC"/>
@@ -951,7 +953,7 @@
                 <w:color w:val="333333"/>
                 <w:sz w:val="18"/>
               </w:rPr>
-              <w:t>New</w:t>
+              <w:t>49</w:t>
             </w:r>
           </w:p>
         </w:tc>
@@ -1066,6 +1068,7 @@
         <w:tc>
           <w:tcPr>
             <w:tcW w:type="dxa" w:w="1680"/>
+            <w:shd w:fill="FFEBEE" w:val="clear" w:color="auto"/>
             <w:tcBorders>
               <w:top w:val="single" w:sz="4" w:space="0" w:color="CCCCCC"/>
               <w:bottom w:val="single" w:sz="4" w:space="0" w:color="CCCCCC"/>
@@ -1082,7 +1085,7 @@
                 <w:color w:val="333333"/>
                 <w:sz w:val="18"/>
               </w:rPr>
-              <w:t>New</w:t>
+              <w:t>49</w:t>
             </w:r>
           </w:p>
         </w:tc>
@@ -1197,6 +1200,7 @@
         <w:tc>
           <w:tcPr>
             <w:tcW w:type="dxa" w:w="1680"/>
+            <w:shd w:fill="FFEBEE" w:val="clear" w:color="auto"/>
             <w:tcBorders>
               <w:top w:val="single" w:sz="4" w:space="0" w:color="CCCCCC"/>
               <w:bottom w:val="single" w:sz="4" w:space="0" w:color="CCCCCC"/>
@@ -1213,793 +1217,7 @@
                 <w:color w:val="333333"/>
                 <w:sz w:val="18"/>
               </w:rPr>
-              <w:t>New</w:t>
-            </w:r>
-          </w:p>
-        </w:tc>
-      </w:tr>
-      <w:tr>
-        <w:tc>
-          <w:tcPr>
-            <w:tcW w:type="dxa" w:w="1680"/>
-            <w:tcBorders>
-              <w:top w:val="single" w:sz="4" w:space="0" w:color="CCCCCC"/>
-              <w:bottom w:val="single" w:sz="4" w:space="0" w:color="CCCCCC"/>
-              <w:left w:val="single" w:sz="4" w:space="0" w:color="CCCCCC"/>
-              <w:right w:val="single" w:sz="4" w:space="0" w:color="CCCCCC"/>
-            </w:tcBorders>
-          </w:tcPr>
-          <w:p>
-            <w:r>
-              <w:rPr>
-                <w:color w:val="333333"/>
-                <w:sz w:val="18"/>
-              </w:rPr>
-              <w:t>CVE-2022-23976</w:t>
-            </w:r>
-          </w:p>
-        </w:tc>
-        <w:tc>
-          <w:tcPr>
-            <w:tcW w:type="dxa" w:w="1680"/>
-            <w:tcBorders>
-              <w:top w:val="single" w:sz="4" w:space="0" w:color="CCCCCC"/>
-              <w:bottom w:val="single" w:sz="4" w:space="0" w:color="CCCCCC"/>
-              <w:left w:val="single" w:sz="4" w:space="0" w:color="CCCCCC"/>
-              <w:right w:val="single" w:sz="4" w:space="0" w:color="CCCCCC"/>
-            </w:tcBorders>
-          </w:tcPr>
-          <w:p>
-            <w:r>
-              <w:rPr>
-                <w:color w:val="333333"/>
-                <w:sz w:val="18"/>
-              </w:rPr>
-              <w:t>WordPress Plugin: access-demo-importer</w:t>
-            </w:r>
-          </w:p>
-        </w:tc>
-        <w:tc>
-          <w:tcPr>
-            <w:tcW w:type="dxa" w:w="1680"/>
-            <w:tcBorders>
-              <w:top w:val="single" w:sz="4" w:space="0" w:color="CCCCCC"/>
-              <w:bottom w:val="single" w:sz="4" w:space="0" w:color="CCCCCC"/>
-              <w:left w:val="single" w:sz="4" w:space="0" w:color="CCCCCC"/>
-              <w:right w:val="single" w:sz="4" w:space="0" w:color="CCCCCC"/>
-            </w:tcBorders>
-          </w:tcPr>
-          <w:p>
-            <w:r>
-              <w:rPr>
-                <w:color w:val="333333"/>
-                <w:sz w:val="18"/>
-              </w:rPr>
-              <w:t>1 system</w:t>
-            </w:r>
-          </w:p>
-        </w:tc>
-        <w:tc>
-          <w:tcPr>
-            <w:tcW w:type="dxa" w:w="1680"/>
-            <w:shd w:fill="E8F5E9" w:val="clear" w:color="auto"/>
-            <w:tcBorders>
-              <w:top w:val="single" w:sz="4" w:space="0" w:color="CCCCCC"/>
-              <w:bottom w:val="single" w:sz="4" w:space="0" w:color="CCCCCC"/>
-              <w:left w:val="single" w:sz="4" w:space="0" w:color="CCCCCC"/>
-              <w:right w:val="single" w:sz="4" w:space="0" w:color="CCCCCC"/>
-            </w:tcBorders>
-          </w:tcPr>
-          <w:p>
-            <w:r>
-              <w:rPr>
-                <w:color w:val="333333"/>
-                <w:sz w:val="18"/>
-              </w:rPr>
-              <w:t>None known</w:t>
-            </w:r>
-          </w:p>
-        </w:tc>
-        <w:tc>
-          <w:tcPr>
-            <w:tcW w:type="dxa" w:w="1680"/>
-            <w:shd w:fill="E8F5E9" w:val="clear" w:color="auto"/>
-            <w:tcBorders>
-              <w:top w:val="single" w:sz="4" w:space="0" w:color="CCCCCC"/>
-              <w:bottom w:val="single" w:sz="4" w:space="0" w:color="CCCCCC"/>
-              <w:left w:val="single" w:sz="4" w:space="0" w:color="CCCCCC"/>
-              <w:right w:val="single" w:sz="4" w:space="0" w:color="CCCCCC"/>
-            </w:tcBorders>
-          </w:tcPr>
-          <w:p>
-            <w:pPr>
-              <w:jc w:val="center"/>
-            </w:pPr>
-            <w:r>
-              <w:rPr>
-                <w:b/>
-                <w:color w:val="333333"/>
-                <w:sz w:val="18"/>
-              </w:rPr>
-              <w:t>P3</w:t>
-            </w:r>
-          </w:p>
-        </w:tc>
-        <w:tc>
-          <w:tcPr>
-            <w:tcW w:type="dxa" w:w="1680"/>
-            <w:tcBorders>
-              <w:top w:val="single" w:sz="4" w:space="0" w:color="CCCCCC"/>
-              <w:bottom w:val="single" w:sz="4" w:space="0" w:color="CCCCCC"/>
-              <w:left w:val="single" w:sz="4" w:space="0" w:color="CCCCCC"/>
-              <w:right w:val="single" w:sz="4" w:space="0" w:color="CCCCCC"/>
-            </w:tcBorders>
-          </w:tcPr>
-          <w:p>
-            <w:pPr>
-              <w:jc w:val="center"/>
-            </w:pPr>
-            <w:r>
-              <w:rPr>
-                <w:color w:val="333333"/>
-                <w:sz w:val="18"/>
-              </w:rPr>
-              <w:t>New</w:t>
-            </w:r>
-          </w:p>
-        </w:tc>
-      </w:tr>
-      <w:tr>
-        <w:tc>
-          <w:tcPr>
-            <w:tcW w:type="dxa" w:w="1680"/>
-            <w:tcBorders>
-              <w:top w:val="single" w:sz="4" w:space="0" w:color="CCCCCC"/>
-              <w:bottom w:val="single" w:sz="4" w:space="0" w:color="CCCCCC"/>
-              <w:left w:val="single" w:sz="4" w:space="0" w:color="CCCCCC"/>
-              <w:right w:val="single" w:sz="4" w:space="0" w:color="CCCCCC"/>
-            </w:tcBorders>
-          </w:tcPr>
-          <w:p>
-            <w:r>
-              <w:rPr>
-                <w:color w:val="333333"/>
-                <w:sz w:val="18"/>
-              </w:rPr>
-              <w:t>CVE-2012-4272</w:t>
-            </w:r>
-          </w:p>
-        </w:tc>
-        <w:tc>
-          <w:tcPr>
-            <w:tcW w:type="dxa" w:w="1680"/>
-            <w:tcBorders>
-              <w:top w:val="single" w:sz="4" w:space="0" w:color="CCCCCC"/>
-              <w:bottom w:val="single" w:sz="4" w:space="0" w:color="CCCCCC"/>
-              <w:left w:val="single" w:sz="4" w:space="0" w:color="CCCCCC"/>
-              <w:right w:val="single" w:sz="4" w:space="0" w:color="CCCCCC"/>
-            </w:tcBorders>
-          </w:tcPr>
-          <w:p>
-            <w:r>
-              <w:rPr>
-                <w:color w:val="333333"/>
-                <w:sz w:val="18"/>
-              </w:rPr>
-              <w:t>WordPress Plugin: 2-click-socialmedia-buttons</w:t>
-            </w:r>
-          </w:p>
-        </w:tc>
-        <w:tc>
-          <w:tcPr>
-            <w:tcW w:type="dxa" w:w="1680"/>
-            <w:tcBorders>
-              <w:top w:val="single" w:sz="4" w:space="0" w:color="CCCCCC"/>
-              <w:bottom w:val="single" w:sz="4" w:space="0" w:color="CCCCCC"/>
-              <w:left w:val="single" w:sz="4" w:space="0" w:color="CCCCCC"/>
-              <w:right w:val="single" w:sz="4" w:space="0" w:color="CCCCCC"/>
-            </w:tcBorders>
-          </w:tcPr>
-          <w:p>
-            <w:r>
-              <w:rPr>
-                <w:color w:val="333333"/>
-                <w:sz w:val="18"/>
-              </w:rPr>
-              <w:t>1 system</w:t>
-            </w:r>
-          </w:p>
-        </w:tc>
-        <w:tc>
-          <w:tcPr>
-            <w:tcW w:type="dxa" w:w="1680"/>
-            <w:shd w:fill="E8F5E9" w:val="clear" w:color="auto"/>
-            <w:tcBorders>
-              <w:top w:val="single" w:sz="4" w:space="0" w:color="CCCCCC"/>
-              <w:bottom w:val="single" w:sz="4" w:space="0" w:color="CCCCCC"/>
-              <w:left w:val="single" w:sz="4" w:space="0" w:color="CCCCCC"/>
-              <w:right w:val="single" w:sz="4" w:space="0" w:color="CCCCCC"/>
-            </w:tcBorders>
-          </w:tcPr>
-          <w:p>
-            <w:r>
-              <w:rPr>
-                <w:color w:val="333333"/>
-                <w:sz w:val="18"/>
-              </w:rPr>
-              <w:t>None known</w:t>
-            </w:r>
-          </w:p>
-        </w:tc>
-        <w:tc>
-          <w:tcPr>
-            <w:tcW w:type="dxa" w:w="1680"/>
-            <w:shd w:fill="E8F5E9" w:val="clear" w:color="auto"/>
-            <w:tcBorders>
-              <w:top w:val="single" w:sz="4" w:space="0" w:color="CCCCCC"/>
-              <w:bottom w:val="single" w:sz="4" w:space="0" w:color="CCCCCC"/>
-              <w:left w:val="single" w:sz="4" w:space="0" w:color="CCCCCC"/>
-              <w:right w:val="single" w:sz="4" w:space="0" w:color="CCCCCC"/>
-            </w:tcBorders>
-          </w:tcPr>
-          <w:p>
-            <w:pPr>
-              <w:jc w:val="center"/>
-            </w:pPr>
-            <w:r>
-              <w:rPr>
-                <w:b/>
-                <w:color w:val="333333"/>
-                <w:sz w:val="18"/>
-              </w:rPr>
-              <w:t>P3</w:t>
-            </w:r>
-          </w:p>
-        </w:tc>
-        <w:tc>
-          <w:tcPr>
-            <w:tcW w:type="dxa" w:w="1680"/>
-            <w:tcBorders>
-              <w:top w:val="single" w:sz="4" w:space="0" w:color="CCCCCC"/>
-              <w:bottom w:val="single" w:sz="4" w:space="0" w:color="CCCCCC"/>
-              <w:left w:val="single" w:sz="4" w:space="0" w:color="CCCCCC"/>
-              <w:right w:val="single" w:sz="4" w:space="0" w:color="CCCCCC"/>
-            </w:tcBorders>
-          </w:tcPr>
-          <w:p>
-            <w:pPr>
-              <w:jc w:val="center"/>
-            </w:pPr>
-            <w:r>
-              <w:rPr>
-                <w:color w:val="333333"/>
-                <w:sz w:val="18"/>
-              </w:rPr>
-              <w:t>New</w:t>
-            </w:r>
-          </w:p>
-        </w:tc>
-      </w:tr>
-      <w:tr>
-        <w:tc>
-          <w:tcPr>
-            <w:tcW w:type="dxa" w:w="1680"/>
-            <w:tcBorders>
-              <w:top w:val="single" w:sz="4" w:space="0" w:color="CCCCCC"/>
-              <w:bottom w:val="single" w:sz="4" w:space="0" w:color="CCCCCC"/>
-              <w:left w:val="single" w:sz="4" w:space="0" w:color="CCCCCC"/>
-              <w:right w:val="single" w:sz="4" w:space="0" w:color="CCCCCC"/>
-            </w:tcBorders>
-          </w:tcPr>
-          <w:p>
-            <w:r>
-              <w:rPr>
-                <w:color w:val="333333"/>
-                <w:sz w:val="18"/>
-              </w:rPr>
-              <w:t>CVE-2017-14622</w:t>
-            </w:r>
-          </w:p>
-        </w:tc>
-        <w:tc>
-          <w:tcPr>
-            <w:tcW w:type="dxa" w:w="1680"/>
-            <w:tcBorders>
-              <w:top w:val="single" w:sz="4" w:space="0" w:color="CCCCCC"/>
-              <w:bottom w:val="single" w:sz="4" w:space="0" w:color="CCCCCC"/>
-              <w:left w:val="single" w:sz="4" w:space="0" w:color="CCCCCC"/>
-              <w:right w:val="single" w:sz="4" w:space="0" w:color="CCCCCC"/>
-            </w:tcBorders>
-          </w:tcPr>
-          <w:p>
-            <w:r>
-              <w:rPr>
-                <w:color w:val="333333"/>
-                <w:sz w:val="18"/>
-              </w:rPr>
-              <w:t>WordPress Plugin: 2kb-amazon-affiliates-store</w:t>
-            </w:r>
-          </w:p>
-        </w:tc>
-        <w:tc>
-          <w:tcPr>
-            <w:tcW w:type="dxa" w:w="1680"/>
-            <w:tcBorders>
-              <w:top w:val="single" w:sz="4" w:space="0" w:color="CCCCCC"/>
-              <w:bottom w:val="single" w:sz="4" w:space="0" w:color="CCCCCC"/>
-              <w:left w:val="single" w:sz="4" w:space="0" w:color="CCCCCC"/>
-              <w:right w:val="single" w:sz="4" w:space="0" w:color="CCCCCC"/>
-            </w:tcBorders>
-          </w:tcPr>
-          <w:p>
-            <w:r>
-              <w:rPr>
-                <w:color w:val="333333"/>
-                <w:sz w:val="18"/>
-              </w:rPr>
-              <w:t>1 system</w:t>
-            </w:r>
-          </w:p>
-        </w:tc>
-        <w:tc>
-          <w:tcPr>
-            <w:tcW w:type="dxa" w:w="1680"/>
-            <w:shd w:fill="E8F5E9" w:val="clear" w:color="auto"/>
-            <w:tcBorders>
-              <w:top w:val="single" w:sz="4" w:space="0" w:color="CCCCCC"/>
-              <w:bottom w:val="single" w:sz="4" w:space="0" w:color="CCCCCC"/>
-              <w:left w:val="single" w:sz="4" w:space="0" w:color="CCCCCC"/>
-              <w:right w:val="single" w:sz="4" w:space="0" w:color="CCCCCC"/>
-            </w:tcBorders>
-          </w:tcPr>
-          <w:p>
-            <w:r>
-              <w:rPr>
-                <w:color w:val="333333"/>
-                <w:sz w:val="18"/>
-              </w:rPr>
-              <w:t>None known</w:t>
-            </w:r>
-          </w:p>
-        </w:tc>
-        <w:tc>
-          <w:tcPr>
-            <w:tcW w:type="dxa" w:w="1680"/>
-            <w:shd w:fill="E8F5E9" w:val="clear" w:color="auto"/>
-            <w:tcBorders>
-              <w:top w:val="single" w:sz="4" w:space="0" w:color="CCCCCC"/>
-              <w:bottom w:val="single" w:sz="4" w:space="0" w:color="CCCCCC"/>
-              <w:left w:val="single" w:sz="4" w:space="0" w:color="CCCCCC"/>
-              <w:right w:val="single" w:sz="4" w:space="0" w:color="CCCCCC"/>
-            </w:tcBorders>
-          </w:tcPr>
-          <w:p>
-            <w:pPr>
-              <w:jc w:val="center"/>
-            </w:pPr>
-            <w:r>
-              <w:rPr>
-                <w:b/>
-                <w:color w:val="333333"/>
-                <w:sz w:val="18"/>
-              </w:rPr>
-              <w:t>P3</w:t>
-            </w:r>
-          </w:p>
-        </w:tc>
-        <w:tc>
-          <w:tcPr>
-            <w:tcW w:type="dxa" w:w="1680"/>
-            <w:tcBorders>
-              <w:top w:val="single" w:sz="4" w:space="0" w:color="CCCCCC"/>
-              <w:bottom w:val="single" w:sz="4" w:space="0" w:color="CCCCCC"/>
-              <w:left w:val="single" w:sz="4" w:space="0" w:color="CCCCCC"/>
-              <w:right w:val="single" w:sz="4" w:space="0" w:color="CCCCCC"/>
-            </w:tcBorders>
-          </w:tcPr>
-          <w:p>
-            <w:pPr>
-              <w:jc w:val="center"/>
-            </w:pPr>
-            <w:r>
-              <w:rPr>
-                <w:color w:val="333333"/>
-                <w:sz w:val="18"/>
-              </w:rPr>
-              <w:t>New</w:t>
-            </w:r>
-          </w:p>
-        </w:tc>
-      </w:tr>
-      <w:tr>
-        <w:tc>
-          <w:tcPr>
-            <w:tcW w:type="dxa" w:w="1680"/>
-            <w:tcBorders>
-              <w:top w:val="single" w:sz="4" w:space="0" w:color="CCCCCC"/>
-              <w:bottom w:val="single" w:sz="4" w:space="0" w:color="CCCCCC"/>
-              <w:left w:val="single" w:sz="4" w:space="0" w:color="CCCCCC"/>
-              <w:right w:val="single" w:sz="4" w:space="0" w:color="CCCCCC"/>
-            </w:tcBorders>
-          </w:tcPr>
-          <w:p>
-            <w:r>
-              <w:rPr>
-                <w:color w:val="333333"/>
-                <w:sz w:val="18"/>
-              </w:rPr>
-              <w:t>CVE-2025-64293</w:t>
-            </w:r>
-          </w:p>
-        </w:tc>
-        <w:tc>
-          <w:tcPr>
-            <w:tcW w:type="dxa" w:w="1680"/>
-            <w:tcBorders>
-              <w:top w:val="single" w:sz="4" w:space="0" w:color="CCCCCC"/>
-              <w:bottom w:val="single" w:sz="4" w:space="0" w:color="CCCCCC"/>
-              <w:left w:val="single" w:sz="4" w:space="0" w:color="CCCCCC"/>
-              <w:right w:val="single" w:sz="4" w:space="0" w:color="CCCCCC"/>
-            </w:tcBorders>
-          </w:tcPr>
-          <w:p>
-            <w:r>
-              <w:rPr>
-                <w:color w:val="333333"/>
-                <w:sz w:val="18"/>
-              </w:rPr>
-              <w:t>WordPress Plugin: 0-day-analytics</w:t>
-            </w:r>
-          </w:p>
-        </w:tc>
-        <w:tc>
-          <w:tcPr>
-            <w:tcW w:type="dxa" w:w="1680"/>
-            <w:tcBorders>
-              <w:top w:val="single" w:sz="4" w:space="0" w:color="CCCCCC"/>
-              <w:bottom w:val="single" w:sz="4" w:space="0" w:color="CCCCCC"/>
-              <w:left w:val="single" w:sz="4" w:space="0" w:color="CCCCCC"/>
-              <w:right w:val="single" w:sz="4" w:space="0" w:color="CCCCCC"/>
-            </w:tcBorders>
-          </w:tcPr>
-          <w:p>
-            <w:r>
-              <w:rPr>
-                <w:color w:val="333333"/>
-                <w:sz w:val="18"/>
-              </w:rPr>
-              <w:t>1 system</w:t>
-            </w:r>
-          </w:p>
-        </w:tc>
-        <w:tc>
-          <w:tcPr>
-            <w:tcW w:type="dxa" w:w="1680"/>
-            <w:shd w:fill="E8F5E9" w:val="clear" w:color="auto"/>
-            <w:tcBorders>
-              <w:top w:val="single" w:sz="4" w:space="0" w:color="CCCCCC"/>
-              <w:bottom w:val="single" w:sz="4" w:space="0" w:color="CCCCCC"/>
-              <w:left w:val="single" w:sz="4" w:space="0" w:color="CCCCCC"/>
-              <w:right w:val="single" w:sz="4" w:space="0" w:color="CCCCCC"/>
-            </w:tcBorders>
-          </w:tcPr>
-          <w:p>
-            <w:r>
-              <w:rPr>
-                <w:color w:val="333333"/>
-                <w:sz w:val="18"/>
-              </w:rPr>
-              <w:t>None known</w:t>
-            </w:r>
-          </w:p>
-        </w:tc>
-        <w:tc>
-          <w:tcPr>
-            <w:tcW w:type="dxa" w:w="1680"/>
-            <w:shd w:fill="E8F5E9" w:val="clear" w:color="auto"/>
-            <w:tcBorders>
-              <w:top w:val="single" w:sz="4" w:space="0" w:color="CCCCCC"/>
-              <w:bottom w:val="single" w:sz="4" w:space="0" w:color="CCCCCC"/>
-              <w:left w:val="single" w:sz="4" w:space="0" w:color="CCCCCC"/>
-              <w:right w:val="single" w:sz="4" w:space="0" w:color="CCCCCC"/>
-            </w:tcBorders>
-          </w:tcPr>
-          <w:p>
-            <w:pPr>
-              <w:jc w:val="center"/>
-            </w:pPr>
-            <w:r>
-              <w:rPr>
-                <w:b/>
-                <w:color w:val="333333"/>
-                <w:sz w:val="18"/>
-              </w:rPr>
-              <w:t>P3</w:t>
-            </w:r>
-          </w:p>
-        </w:tc>
-        <w:tc>
-          <w:tcPr>
-            <w:tcW w:type="dxa" w:w="1680"/>
-            <w:tcBorders>
-              <w:top w:val="single" w:sz="4" w:space="0" w:color="CCCCCC"/>
-              <w:bottom w:val="single" w:sz="4" w:space="0" w:color="CCCCCC"/>
-              <w:left w:val="single" w:sz="4" w:space="0" w:color="CCCCCC"/>
-              <w:right w:val="single" w:sz="4" w:space="0" w:color="CCCCCC"/>
-            </w:tcBorders>
-          </w:tcPr>
-          <w:p>
-            <w:pPr>
-              <w:jc w:val="center"/>
-            </w:pPr>
-            <w:r>
-              <w:rPr>
-                <w:color w:val="333333"/>
-                <w:sz w:val="18"/>
-              </w:rPr>
-              <w:t>New</w:t>
-            </w:r>
-          </w:p>
-        </w:tc>
-      </w:tr>
-      <w:tr>
-        <w:tc>
-          <w:tcPr>
-            <w:tcW w:type="dxa" w:w="1680"/>
-            <w:tcBorders>
-              <w:top w:val="single" w:sz="4" w:space="0" w:color="CCCCCC"/>
-              <w:bottom w:val="single" w:sz="4" w:space="0" w:color="CCCCCC"/>
-              <w:left w:val="single" w:sz="4" w:space="0" w:color="CCCCCC"/>
-              <w:right w:val="single" w:sz="4" w:space="0" w:color="CCCCCC"/>
-            </w:tcBorders>
-          </w:tcPr>
-          <w:p>
-            <w:r>
-              <w:rPr>
-                <w:color w:val="333333"/>
-                <w:sz w:val="18"/>
-              </w:rPr>
-              <w:t>CVE-2024-13555</w:t>
-            </w:r>
-          </w:p>
-        </w:tc>
-        <w:tc>
-          <w:tcPr>
-            <w:tcW w:type="dxa" w:w="1680"/>
-            <w:tcBorders>
-              <w:top w:val="single" w:sz="4" w:space="0" w:color="CCCCCC"/>
-              <w:bottom w:val="single" w:sz="4" w:space="0" w:color="CCCCCC"/>
-              <w:left w:val="single" w:sz="4" w:space="0" w:color="CCCCCC"/>
-              <w:right w:val="single" w:sz="4" w:space="0" w:color="CCCCCC"/>
-            </w:tcBorders>
-          </w:tcPr>
-          <w:p>
-            <w:r>
-              <w:rPr>
-                <w:color w:val="333333"/>
-                <w:sz w:val="18"/>
-              </w:rPr>
-              <w:t>WordPress Plugin: 1-click-migration</w:t>
-            </w:r>
-          </w:p>
-        </w:tc>
-        <w:tc>
-          <w:tcPr>
-            <w:tcW w:type="dxa" w:w="1680"/>
-            <w:tcBorders>
-              <w:top w:val="single" w:sz="4" w:space="0" w:color="CCCCCC"/>
-              <w:bottom w:val="single" w:sz="4" w:space="0" w:color="CCCCCC"/>
-              <w:left w:val="single" w:sz="4" w:space="0" w:color="CCCCCC"/>
-              <w:right w:val="single" w:sz="4" w:space="0" w:color="CCCCCC"/>
-            </w:tcBorders>
-          </w:tcPr>
-          <w:p>
-            <w:r>
-              <w:rPr>
-                <w:color w:val="333333"/>
-                <w:sz w:val="18"/>
-              </w:rPr>
-              <w:t>1 system</w:t>
-            </w:r>
-          </w:p>
-        </w:tc>
-        <w:tc>
-          <w:tcPr>
-            <w:tcW w:type="dxa" w:w="1680"/>
-            <w:shd w:fill="E8F5E9" w:val="clear" w:color="auto"/>
-            <w:tcBorders>
-              <w:top w:val="single" w:sz="4" w:space="0" w:color="CCCCCC"/>
-              <w:bottom w:val="single" w:sz="4" w:space="0" w:color="CCCCCC"/>
-              <w:left w:val="single" w:sz="4" w:space="0" w:color="CCCCCC"/>
-              <w:right w:val="single" w:sz="4" w:space="0" w:color="CCCCCC"/>
-            </w:tcBorders>
-          </w:tcPr>
-          <w:p>
-            <w:r>
-              <w:rPr>
-                <w:color w:val="333333"/>
-                <w:sz w:val="18"/>
-              </w:rPr>
-              <w:t>None known</w:t>
-            </w:r>
-          </w:p>
-        </w:tc>
-        <w:tc>
-          <w:tcPr>
-            <w:tcW w:type="dxa" w:w="1680"/>
-            <w:shd w:fill="E8F5E9" w:val="clear" w:color="auto"/>
-            <w:tcBorders>
-              <w:top w:val="single" w:sz="4" w:space="0" w:color="CCCCCC"/>
-              <w:bottom w:val="single" w:sz="4" w:space="0" w:color="CCCCCC"/>
-              <w:left w:val="single" w:sz="4" w:space="0" w:color="CCCCCC"/>
-              <w:right w:val="single" w:sz="4" w:space="0" w:color="CCCCCC"/>
-            </w:tcBorders>
-          </w:tcPr>
-          <w:p>
-            <w:pPr>
-              <w:jc w:val="center"/>
-            </w:pPr>
-            <w:r>
-              <w:rPr>
-                <w:b/>
-                <w:color w:val="333333"/>
-                <w:sz w:val="18"/>
-              </w:rPr>
-              <w:t>P3</w:t>
-            </w:r>
-          </w:p>
-        </w:tc>
-        <w:tc>
-          <w:tcPr>
-            <w:tcW w:type="dxa" w:w="1680"/>
-            <w:tcBorders>
-              <w:top w:val="single" w:sz="4" w:space="0" w:color="CCCCCC"/>
-              <w:bottom w:val="single" w:sz="4" w:space="0" w:color="CCCCCC"/>
-              <w:left w:val="single" w:sz="4" w:space="0" w:color="CCCCCC"/>
-              <w:right w:val="single" w:sz="4" w:space="0" w:color="CCCCCC"/>
-            </w:tcBorders>
-          </w:tcPr>
-          <w:p>
-            <w:pPr>
-              <w:jc w:val="center"/>
-            </w:pPr>
-            <w:r>
-              <w:rPr>
-                <w:color w:val="333333"/>
-                <w:sz w:val="18"/>
-              </w:rPr>
-              <w:t>New</w:t>
-            </w:r>
-          </w:p>
-        </w:tc>
-      </w:tr>
-      <w:tr>
-        <w:tc>
-          <w:tcPr>
-            <w:tcW w:type="dxa" w:w="1680"/>
-            <w:tcBorders>
-              <w:top w:val="single" w:sz="4" w:space="0" w:color="CCCCCC"/>
-              <w:bottom w:val="single" w:sz="4" w:space="0" w:color="CCCCCC"/>
-              <w:left w:val="single" w:sz="4" w:space="0" w:color="CCCCCC"/>
-              <w:right w:val="single" w:sz="4" w:space="0" w:color="CCCCCC"/>
-            </w:tcBorders>
-          </w:tcPr>
-          <w:p>
-            <w:r>
-              <w:rPr>
-                <w:color w:val="333333"/>
-                <w:sz w:val="18"/>
-              </w:rPr>
-              <w:t>CVE-2024-13609</w:t>
-            </w:r>
-          </w:p>
-        </w:tc>
-        <w:tc>
-          <w:tcPr>
-            <w:tcW w:type="dxa" w:w="1680"/>
-            <w:tcBorders>
-              <w:top w:val="single" w:sz="4" w:space="0" w:color="CCCCCC"/>
-              <w:bottom w:val="single" w:sz="4" w:space="0" w:color="CCCCCC"/>
-              <w:left w:val="single" w:sz="4" w:space="0" w:color="CCCCCC"/>
-              <w:right w:val="single" w:sz="4" w:space="0" w:color="CCCCCC"/>
-            </w:tcBorders>
-          </w:tcPr>
-          <w:p>
-            <w:r>
-              <w:rPr>
-                <w:color w:val="333333"/>
-                <w:sz w:val="18"/>
-              </w:rPr>
-              <w:t>WordPress Plugin: 1-click-migration</w:t>
-            </w:r>
-          </w:p>
-        </w:tc>
-        <w:tc>
-          <w:tcPr>
-            <w:tcW w:type="dxa" w:w="1680"/>
-            <w:tcBorders>
-              <w:top w:val="single" w:sz="4" w:space="0" w:color="CCCCCC"/>
-              <w:bottom w:val="single" w:sz="4" w:space="0" w:color="CCCCCC"/>
-              <w:left w:val="single" w:sz="4" w:space="0" w:color="CCCCCC"/>
-              <w:right w:val="single" w:sz="4" w:space="0" w:color="CCCCCC"/>
-            </w:tcBorders>
-          </w:tcPr>
-          <w:p>
-            <w:r>
-              <w:rPr>
-                <w:color w:val="333333"/>
-                <w:sz w:val="18"/>
-              </w:rPr>
-              <w:t>1 system</w:t>
-            </w:r>
-          </w:p>
-        </w:tc>
-        <w:tc>
-          <w:tcPr>
-            <w:tcW w:type="dxa" w:w="1680"/>
-            <w:shd w:fill="E8F5E9" w:val="clear" w:color="auto"/>
-            <w:tcBorders>
-              <w:top w:val="single" w:sz="4" w:space="0" w:color="CCCCCC"/>
-              <w:bottom w:val="single" w:sz="4" w:space="0" w:color="CCCCCC"/>
-              <w:left w:val="single" w:sz="4" w:space="0" w:color="CCCCCC"/>
-              <w:right w:val="single" w:sz="4" w:space="0" w:color="CCCCCC"/>
-            </w:tcBorders>
-          </w:tcPr>
-          <w:p>
-            <w:r>
-              <w:rPr>
-                <w:color w:val="333333"/>
-                <w:sz w:val="18"/>
-              </w:rPr>
-              <w:t>None known</w:t>
-            </w:r>
-          </w:p>
-        </w:tc>
-        <w:tc>
-          <w:tcPr>
-            <w:tcW w:type="dxa" w:w="1680"/>
-            <w:shd w:fill="E8F5E9" w:val="clear" w:color="auto"/>
-            <w:tcBorders>
-              <w:top w:val="single" w:sz="4" w:space="0" w:color="CCCCCC"/>
-              <w:bottom w:val="single" w:sz="4" w:space="0" w:color="CCCCCC"/>
-              <w:left w:val="single" w:sz="4" w:space="0" w:color="CCCCCC"/>
-              <w:right w:val="single" w:sz="4" w:space="0" w:color="CCCCCC"/>
-            </w:tcBorders>
-          </w:tcPr>
-          <w:p>
-            <w:pPr>
-              <w:jc w:val="center"/>
-            </w:pPr>
-            <w:r>
-              <w:rPr>
-                <w:b/>
-                <w:color w:val="333333"/>
-                <w:sz w:val="18"/>
-              </w:rPr>
-              <w:t>P3</w:t>
-            </w:r>
-          </w:p>
-        </w:tc>
-        <w:tc>
-          <w:tcPr>
-            <w:tcW w:type="dxa" w:w="1680"/>
-            <w:tcBorders>
-              <w:top w:val="single" w:sz="4" w:space="0" w:color="CCCCCC"/>
-              <w:bottom w:val="single" w:sz="4" w:space="0" w:color="CCCCCC"/>
-              <w:left w:val="single" w:sz="4" w:space="0" w:color="CCCCCC"/>
-              <w:right w:val="single" w:sz="4" w:space="0" w:color="CCCCCC"/>
-            </w:tcBorders>
-          </w:tcPr>
-          <w:p>
-            <w:pPr>
-              <w:jc w:val="center"/>
-            </w:pPr>
-            <w:r>
-              <w:rPr>
-                <w:color w:val="333333"/>
-                <w:sz w:val="18"/>
-              </w:rPr>
-              <w:t>New</w:t>
+              <w:t>49</w:t>
             </w:r>
           </w:p>
         </w:tc>
@@ -2183,7 +1401,7 @@
                 <w:color w:val="333333"/>
                 <w:sz w:val="18"/>
               </w:rPr>
-              <w:t>Monitor for ransomware activity, suspicious file encryption, and unauthorized access attempts.</w:t>
+              <w:t>Monitor for ransomware payloads, suspicious file encryption activity, and extortion attempts; review endpoint protection logs for anomalous behavior</w:t>
             </w:r>
           </w:p>
         </w:tc>
@@ -2249,7 +1467,7 @@
                 <w:color w:val="333333"/>
                 <w:sz w:val="18"/>
               </w:rPr>
-              <w:t>Watch for credential harvesting, lateral movement, and connections to Russian IPs.</w:t>
+              <w:t>Monitor for credential harvesting, unauthorized access attempts, and suspicious outbound connections</w:t>
             </w:r>
           </w:p>
         </w:tc>
@@ -2272,9 +1490,9 @@
                 <w:color w:val="333333"/>
                 <w:sz w:val="18"/>
               </w:rPr>
-              <w:t>Iran</w:t>
+              <w:t>Unknown</w:t>
               <w:br/>
-              <w:t>State-Sponsored</w:t>
+              <w:t>Criminal</w:t>
             </w:r>
           </w:p>
         </w:tc>
@@ -2294,7 +1512,7 @@
                 <w:color w:val="333333"/>
                 <w:sz w:val="18"/>
               </w:rPr>
-              <w:t>HYDRO KITTEN</w:t>
+              <w:t>HOOK SPIDER</w:t>
             </w:r>
           </w:p>
         </w:tc>
@@ -2315,139 +1533,7 @@
                 <w:color w:val="333333"/>
                 <w:sz w:val="18"/>
               </w:rPr>
-              <w:t>Monitor for phishing campaigns, suspicious PowerShell activity, and unauthorized access.</w:t>
-            </w:r>
-          </w:p>
-        </w:tc>
-      </w:tr>
-      <w:tr>
-        <w:tc>
-          <w:tcPr>
-            <w:tcW w:type="dxa" w:w="3360"/>
-            <w:shd w:fill="F5F5F5" w:val="clear" w:color="auto"/>
-            <w:tcBorders>
-              <w:top w:val="single" w:sz="4" w:space="0" w:color="CCCCCC"/>
-              <w:bottom w:val="single" w:sz="4" w:space="0" w:color="CCCCCC"/>
-              <w:left w:val="single" w:sz="4" w:space="0" w:color="CCCCCC"/>
-              <w:right w:val="single" w:sz="4" w:space="0" w:color="CCCCCC"/>
-            </w:tcBorders>
-          </w:tcPr>
-          <w:p>
-            <w:r>
-              <w:rPr>
-                <w:color w:val="333333"/>
-                <w:sz w:val="18"/>
-              </w:rPr>
-              <w:t>China</w:t>
-              <w:br/>
-              <w:t>State-Sponsored</w:t>
-            </w:r>
-          </w:p>
-        </w:tc>
-        <w:tc>
-          <w:tcPr>
-            <w:tcW w:type="dxa" w:w="3360"/>
-            <w:tcBorders>
-              <w:top w:val="single" w:sz="4" w:space="0" w:color="CCCCCC"/>
-              <w:bottom w:val="single" w:sz="4" w:space="0" w:color="CCCCCC"/>
-              <w:left w:val="single" w:sz="4" w:space="0" w:color="CCCCCC"/>
-              <w:right w:val="single" w:sz="4" w:space="0" w:color="CCCCCC"/>
-            </w:tcBorders>
-          </w:tcPr>
-          <w:p>
-            <w:r>
-              <w:rPr>
-                <w:color w:val="333333"/>
-                <w:sz w:val="18"/>
-              </w:rPr>
-              <w:t>VERTIGO PANDA</w:t>
-            </w:r>
-          </w:p>
-        </w:tc>
-        <w:tc>
-          <w:tcPr>
-            <w:tcW w:type="dxa" w:w="3360"/>
-            <w:shd w:fill="E3F2FD" w:val="clear" w:color="auto"/>
-            <w:tcBorders>
-              <w:top w:val="single" w:sz="4" w:space="0" w:color="CCCCCC"/>
-              <w:bottom w:val="single" w:sz="4" w:space="0" w:color="CCCCCC"/>
-              <w:left w:val="single" w:sz="4" w:space="0" w:color="CCCCCC"/>
-              <w:right w:val="single" w:sz="4" w:space="0" w:color="CCCCCC"/>
-            </w:tcBorders>
-          </w:tcPr>
-          <w:p>
-            <w:r>
-              <w:rPr>
-                <w:color w:val="333333"/>
-                <w:sz w:val="18"/>
-              </w:rPr>
-              <w:t>Scan for data exfiltration attempts, unusual outbound traffic, and compromised vendor accounts.</w:t>
-            </w:r>
-          </w:p>
-        </w:tc>
-      </w:tr>
-      <w:tr>
-        <w:tc>
-          <w:tcPr>
-            <w:tcW w:type="dxa" w:w="3360"/>
-            <w:shd w:fill="F5F5F5" w:val="clear" w:color="auto"/>
-            <w:tcBorders>
-              <w:top w:val="single" w:sz="4" w:space="0" w:color="CCCCCC"/>
-              <w:bottom w:val="single" w:sz="4" w:space="0" w:color="CCCCCC"/>
-              <w:left w:val="single" w:sz="4" w:space="0" w:color="CCCCCC"/>
-              <w:right w:val="single" w:sz="4" w:space="0" w:color="CCCCCC"/>
-            </w:tcBorders>
-          </w:tcPr>
-          <w:p>
-            <w:r>
-              <w:rPr>
-                <w:color w:val="333333"/>
-                <w:sz w:val="18"/>
-              </w:rPr>
-              <w:t>North Korea</w:t>
-              <w:br/>
-              <w:t>State-Sponsored</w:t>
-            </w:r>
-          </w:p>
-        </w:tc>
-        <w:tc>
-          <w:tcPr>
-            <w:tcW w:type="dxa" w:w="3360"/>
-            <w:tcBorders>
-              <w:top w:val="single" w:sz="4" w:space="0" w:color="CCCCCC"/>
-              <w:bottom w:val="single" w:sz="4" w:space="0" w:color="CCCCCC"/>
-              <w:left w:val="single" w:sz="4" w:space="0" w:color="CCCCCC"/>
-              <w:right w:val="single" w:sz="4" w:space="0" w:color="CCCCCC"/>
-            </w:tcBorders>
-          </w:tcPr>
-          <w:p>
-            <w:r>
-              <w:rPr>
-                <w:color w:val="333333"/>
-                <w:sz w:val="18"/>
-              </w:rPr>
-              <w:t>RICOCHET CHOLLIMA</w:t>
-            </w:r>
-          </w:p>
-        </w:tc>
-        <w:tc>
-          <w:tcPr>
-            <w:tcW w:type="dxa" w:w="3360"/>
-            <w:shd w:fill="E3F2FD" w:val="clear" w:color="auto"/>
-            <w:tcBorders>
-              <w:top w:val="single" w:sz="4" w:space="0" w:color="CCCCCC"/>
-              <w:bottom w:val="single" w:sz="4" w:space="0" w:color="CCCCCC"/>
-              <w:left w:val="single" w:sz="4" w:space="0" w:color="CCCCCC"/>
-              <w:right w:val="single" w:sz="4" w:space="0" w:color="CCCCCC"/>
-            </w:tcBorders>
-          </w:tcPr>
-          <w:p>
-            <w:r>
-              <w:rPr>
-                <w:color w:val="333333"/>
-                <w:sz w:val="18"/>
-              </w:rPr>
-              <w:t>Monitor for spear phishing, malware delivery, and connections to Asia-Pacific regions.</w:t>
+              <w:t>Monitor for vishing attempts, social engineering, and malware delivery via email or collaboration platforms</w:t>
             </w:r>
           </w:p>
         </w:tc>
@@ -2476,7 +1562,7 @@
           <w:b/>
           <w:sz w:val="20"/>
         </w:rPr>
-        <w:t>CVE-2023-33999 (WordPress Plugin: 2mb-autocode): A vulnerability affecting multiple systems, potentially allowing unauthorized access or code execution.</w:t>
+        <w:t>CVE-2023-33999 (WordPress Plugin: 2mb-autocode): Vulnerability detected on seven systems; details not specified but high exposure increases risk</w:t>
       </w:r>
     </w:p>
     <w:p>
@@ -2488,7 +1574,7 @@
           <w:b/>
           <w:sz w:val="20"/>
         </w:rPr>
-        <w:t>CVE-2021-39317 (WordPress Plugin: access-demo-importer): A vulnerability with potential for privilege escalation or unauthorized access.</w:t>
+        <w:t>CVE-2021-39317 (WordPress Plugin: access-demo-importer): Vulnerability detected on seven systems; details not specified but high exposure increases risk</w:t>
       </w:r>
     </w:p>
     <w:p>
@@ -2500,7 +1586,7 @@
           <w:b/>
           <w:sz w:val="20"/>
         </w:rPr>
-        <w:t>CVE-2022-23975 (WordPress Plugin: access-demo-importer): A vulnerability that could be exploited for remote code execution or data compromise.</w:t>
+        <w:t>CVE-2022-23975 (WordPress Plugin: access-demo-importer): Vulnerability detected on seven systems; details not specified but high exposure increases risk</w:t>
       </w:r>
     </w:p>
     <w:p>
@@ -2512,19 +1598,7 @@
           <w:b/>
           <w:sz w:val="20"/>
         </w:rPr>
-        <w:t>CVE-2022-4974 (WordPress Plugin: 3d-viewer): A vulnerability with potential for unauthorized access or denial of service.</w:t>
-      </w:r>
-    </w:p>
-    <w:p>
-      <w:pPr>
-        <w:pStyle w:val="ListBullet"/>
-      </w:pPr>
-      <w:r>
-        <w:rPr>
-          <w:b/>
-          <w:sz w:val="20"/>
-        </w:rPr>
-        <w:t>CVE-2022-23976 (WordPress Plugin: access-demo-importer): A vulnerability that may allow unauthorized access or manipulation.</w:t>
+        <w:t>CVE-2022-4974 (WordPress Plugin: 3d-viewer): Vulnerability detected on six systems; details not specified but wide exposure increases risk</w:t>
       </w:r>
     </w:p>
     <w:p/>
@@ -2549,19 +1623,7 @@
         <w:rPr>
           <w:sz w:val="20"/>
         </w:rPr>
-        <w:t>Patch high-severity vulnerabilities with wide exposure (e.g., CVE-2023-33999, CVE-2021-39317, CVE-2022-23975) within 7-14 days to reduce risk of lateral movement and data compromise.</w:t>
-      </w:r>
-    </w:p>
-    <w:p>
-      <w:pPr>
-        <w:pStyle w:val="ListBullet"/>
-      </w:pPr>
-      <w:r>
-        <w:rPr>
-          <w:b/>
-          <w:sz w:val="20"/>
-        </w:rPr>
-        <w:t>Review and remediate legacy vulnerabilities (e.g., CVE-2012-4272, CVE-2017-14622) on critical assets to mitigate supply chain and legacy device risk.</w:t>
+        <w:t>Patch all CVEs detected on five or more systems within seven days, prioritizing CVE-2023-33999, CVE-2021-39317, CVE-2022-23975, and CVE-2022-4974</w:t>
       </w:r>
     </w:p>
     <w:p>
@@ -2572,7 +1634,7 @@
         <w:rPr>
           <w:sz w:val="20"/>
         </w:rPr>
-        <w:t>Enhance threat monitoring for ransomware and APT activity targeting manufacturing, healthcare, and biotech sectors, including indicators from CrowdStrike and Intel471.</w:t>
+        <w:t>Conduct targeted threat hunting for ransomware and extortion activity associated with VICE SPIDER, TRAVELING SPIDER, and HOOK SPIDER</w:t>
       </w:r>
     </w:p>
     <w:p>
@@ -2583,7 +1645,7 @@
         <w:rPr>
           <w:sz w:val="20"/>
         </w:rPr>
-        <w:t>Implement stricter access controls and network segmentation for laboratory equipment and IoT devices to prevent exploitation of vulnerabilities.</w:t>
+        <w:t>Review access controls and audit logs for systems storing research and patient data to ensure compliance with HIPAA and FDA requirements</w:t>
       </w:r>
     </w:p>
     <w:p>
@@ -2592,10 +1654,20 @@
       </w:pPr>
       <w:r>
         <w:rPr>
-          <w:b/>
           <w:sz w:val="20"/>
         </w:rPr>
-        <w:t>Conduct regular vulnerability scans and prioritize remediation based on exposure and asset criticality, maintaining compliance with HIPAA and FDA requirements.</w:t>
+        <w:t>Monitor for vishing and social engineering attempts, especially those leveraging collaboration platforms as reported in OSINT articles</w:t>
+      </w:r>
+    </w:p>
+    <w:p>
+      <w:pPr>
+        <w:pStyle w:val="ListBullet"/>
+      </w:pPr>
+      <w:r>
+        <w:rPr>
+          <w:sz w:val="20"/>
+        </w:rPr>
+        <w:t>Update endpoint protection and network monitoring rules to detect anomalous activity and known indicators from Intel471 and CrowdStrike feeds</w:t>
       </w:r>
     </w:p>
     <w:p/>

</xml_diff>

<commit_message>
Streamline weekly report: filter CVEs by exploitation status, add debug mode, remove priority scoring
Remove priority/exploited-by columns from vulnerability table - prioritization decisions should be made by security teams, not automated scoring.

CVE filtering now only shows vulnerabilities that are actively exploited in the wild, used by threat actors, or targeting Illumina industries (manufacturing, biotech, medical device, clinical, genomics).

Replace Sources and Priority Methodology sections with compact AI disclaimer box explaining report generation and intelligence sources.

Add --debug flag to test_local.py for verbose logging output (clean output by default). Fix Unicode encoding issues in print functions for Windows console compatibility.

Co-authored-by: Cursor <cursoragent@cursor.com>
</commit_message>
<xml_diff>
--- a/reports/CTI_Weekly_Report_2026-04-25.docx
+++ b/reports/CTI_Weekly_Report_2026-04-25.docx
@@ -70,7 +70,7 @@
           <w:color w:val="333333"/>
           <w:sz w:val="21"/>
         </w:rPr>
-        <w:t>This week's threat intelligence analysis reveals a broad spectrum of vulnerabilities detected across our environment, with several CVEs impacting critical systems relevant to genomics, biotech, and manufacturing operations. While none of the detected vulnerabilities are currently flagged as actively exploited, several high and critical severity CVEs are present on multiple systems, increasing the risk of compromise to research data, intellectual property, laboratory equipment, and healthcare systems. Notably, CVE-2023-33999 and CVE-2021-39317 are detected on seven systems each, elevating their risk profile due to wider exposure. The presence of vulnerabilities in legacy systems and laboratory IoT devices further increases the risk of disruption to operational workflows and regulatory compliance, including HIPAA and FDA requirements. CrowdStrike APT activity highlights ongoing targeting of manufacturing and healthcare sectors by both criminal and state-sponsored actors, with groups such as VICE SPIDER, TRAVELING SPIDER, and RICOCHET CHOLLIMA maintaining active campaigns. OSINT sources indicate a surge in AI-powered phishing and extortion attacks, as well as persistent malware targeting network infrastructure and healthcare organizations. These trends underscore the need for proactive patch management, enhanced monitoring, and supply chain vigilance to mitigate risks to sensitive research and patient data.</w:t>
+        <w:t>This week's threat intelligence analysis reveals significant vulnerability exposure across our genomics and biotech manufacturing environment, with over 36 CVEs detected on production systems. Several vulnerabilities impact critical infrastructure, including laboratory equipment, IoT devices, and healthcare systems, posing risks to research data, intellectual property, and regulatory compliance. Notably, CVE-2023-33999, CVE-2021-39317, and CVE-2022-23975 are present on multiple systems, increasing the risk of lateral movement and potential data exfiltration. While none of the detected CVEs are currently flagged as actively exploited, the presence of high-severity vulnerabilities and wide exposure demands immediate attention to prevent opportunistic attacks and ensure operational continuity. CrowdStrike and Intel471 reports highlight ongoing activity from criminal and state-sponsored threat actors targeting manufacturing and healthcare sectors. These actors are known for leveraging vulnerabilities in IoT and supply chain systems to gain access and disrupt operations. OSINT sources further indicate an uptick in AI-powered phishing and extortion campaigns, as well as persistent malware targeting network devices and healthcare providers. The combination of vulnerability exposure and targeted threat actor activity underscores the importance of timely patching, enhanced monitoring, and supply chain risk management to protect sensitive research and patient data.</w:t>
       </w:r>
     </w:p>
     <w:p>
@@ -441,7 +441,7 @@
                 <w:color w:val="FF3B3B"/>
                 <w:sz w:val="44"/>
               </w:rPr>
-              <w:t>4</w:t>
+              <w:t>5</w:t>
             </w:r>
           </w:p>
           <w:p>
@@ -890,7 +890,7 @@
         <w:tc>
           <w:tcPr>
             <w:tcW w:type="dxa" w:w="1680"/>
-            <w:shd w:fill="E8F5E9" w:val="clear" w:color="auto"/>
+            <w:shd w:fill="FFEBEE" w:val="clear" w:color="auto"/>
             <w:tcBorders>
               <w:top w:val="single" w:sz="4" w:space="0" w:color="CCCCCC"/>
               <w:bottom w:val="single" w:sz="4" w:space="0" w:color="CCCCCC"/>
@@ -904,7 +904,7 @@
                 <w:color w:val="333333"/>
                 <w:sz w:val="18"/>
               </w:rPr>
-              <w:t>None known</w:t>
+              <w:t>Minimal exploit probability (EPSS 1.41%)</w:t>
             </w:r>
           </w:p>
         </w:tc>
@@ -1022,7 +1022,7 @@
         <w:tc>
           <w:tcPr>
             <w:tcW w:type="dxa" w:w="1680"/>
-            <w:shd w:fill="E8F5E9" w:val="clear" w:color="auto"/>
+            <w:shd w:fill="FFEBEE" w:val="clear" w:color="auto"/>
             <w:tcBorders>
               <w:top w:val="single" w:sz="4" w:space="0" w:color="CCCCCC"/>
               <w:bottom w:val="single" w:sz="4" w:space="0" w:color="CCCCCC"/>
@@ -1036,7 +1036,7 @@
                 <w:color w:val="333333"/>
                 <w:sz w:val="18"/>
               </w:rPr>
-              <w:t>None known</w:t>
+              <w:t>Minimal exploit probability (EPSS 0.18%)</w:t>
             </w:r>
           </w:p>
         </w:tc>
@@ -1154,7 +1154,7 @@
         <w:tc>
           <w:tcPr>
             <w:tcW w:type="dxa" w:w="1680"/>
-            <w:shd w:fill="E8F5E9" w:val="clear" w:color="auto"/>
+            <w:shd w:fill="FFEBEE" w:val="clear" w:color="auto"/>
             <w:tcBorders>
               <w:top w:val="single" w:sz="4" w:space="0" w:color="CCCCCC"/>
               <w:bottom w:val="single" w:sz="4" w:space="0" w:color="CCCCCC"/>
@@ -1168,7 +1168,7 @@
                 <w:color w:val="333333"/>
                 <w:sz w:val="18"/>
               </w:rPr>
-              <w:t>None known</w:t>
+              <w:t>Minimal exploit probability (EPSS 0.21%)</w:t>
             </w:r>
           </w:p>
         </w:tc>
@@ -1286,7 +1286,7 @@
         <w:tc>
           <w:tcPr>
             <w:tcW w:type="dxa" w:w="1680"/>
-            <w:shd w:fill="E8F5E9" w:val="clear" w:color="auto"/>
+            <w:shd w:fill="FFEBEE" w:val="clear" w:color="auto"/>
             <w:tcBorders>
               <w:top w:val="single" w:sz="4" w:space="0" w:color="CCCCCC"/>
               <w:bottom w:val="single" w:sz="4" w:space="0" w:color="CCCCCC"/>
@@ -1300,7 +1300,7 @@
                 <w:color w:val="333333"/>
                 <w:sz w:val="18"/>
               </w:rPr>
-              <w:t>None known</w:t>
+              <w:t>Minimal exploit probability (EPSS 0.21%)</w:t>
             </w:r>
           </w:p>
         </w:tc>
@@ -1371,7 +1371,7 @@
                 <w:color w:val="333333"/>
                 <w:sz w:val="18"/>
               </w:rPr>
-              <w:t>CVE-2012-4272</w:t>
+              <w:t>CVE-2021-24732</w:t>
             </w:r>
           </w:p>
         </w:tc>
@@ -1391,7 +1391,7 @@
                 <w:color w:val="333333"/>
                 <w:sz w:val="18"/>
               </w:rPr>
-              <w:t>WordPress Plugin: 2-click-socialmedia-buttons</w:t>
+              <w:t>WordPress Plugin: 3d-flipbook-dflip-lite</w:t>
             </w:r>
           </w:p>
         </w:tc>
@@ -1418,7 +1418,7 @@
         <w:tc>
           <w:tcPr>
             <w:tcW w:type="dxa" w:w="1680"/>
-            <w:shd w:fill="E8F5E9" w:val="clear" w:color="auto"/>
+            <w:shd w:fill="FFEBEE" w:val="clear" w:color="auto"/>
             <w:tcBorders>
               <w:top w:val="single" w:sz="4" w:space="0" w:color="CCCCCC"/>
               <w:bottom w:val="single" w:sz="4" w:space="0" w:color="CCCCCC"/>
@@ -1432,139 +1432,7 @@
                 <w:color w:val="333333"/>
                 <w:sz w:val="18"/>
               </w:rPr>
-              <w:t>None known</w:t>
-            </w:r>
-          </w:p>
-        </w:tc>
-        <w:tc>
-          <w:tcPr>
-            <w:tcW w:type="dxa" w:w="1680"/>
-            <w:shd w:fill="E8F5E9" w:val="clear" w:color="auto"/>
-            <w:tcBorders>
-              <w:top w:val="single" w:sz="4" w:space="0" w:color="CCCCCC"/>
-              <w:bottom w:val="single" w:sz="4" w:space="0" w:color="CCCCCC"/>
-              <w:left w:val="single" w:sz="4" w:space="0" w:color="CCCCCC"/>
-              <w:right w:val="single" w:sz="4" w:space="0" w:color="CCCCCC"/>
-            </w:tcBorders>
-          </w:tcPr>
-          <w:p>
-            <w:pPr>
-              <w:jc w:val="center"/>
-            </w:pPr>
-            <w:r>
-              <w:rPr>
-                <w:b/>
-                <w:color w:val="333333"/>
-                <w:sz w:val="18"/>
-              </w:rPr>
-              <w:t>P3</w:t>
-            </w:r>
-          </w:p>
-        </w:tc>
-        <w:tc>
-          <w:tcPr>
-            <w:tcW w:type="dxa" w:w="1680"/>
-            <w:shd w:fill="FFEBEE" w:val="clear" w:color="auto"/>
-            <w:tcBorders>
-              <w:top w:val="single" w:sz="4" w:space="0" w:color="CCCCCC"/>
-              <w:bottom w:val="single" w:sz="4" w:space="0" w:color="CCCCCC"/>
-              <w:left w:val="single" w:sz="4" w:space="0" w:color="CCCCCC"/>
-              <w:right w:val="single" w:sz="4" w:space="0" w:color="CCCCCC"/>
-            </w:tcBorders>
-          </w:tcPr>
-          <w:p>
-            <w:pPr>
-              <w:jc w:val="center"/>
-            </w:pPr>
-            <w:r>
-              <w:rPr>
-                <w:color w:val="333333"/>
-                <w:sz w:val="18"/>
-              </w:rPr>
-              <w:t>49</w:t>
-            </w:r>
-          </w:p>
-        </w:tc>
-      </w:tr>
-      <w:tr>
-        <w:tc>
-          <w:tcPr>
-            <w:tcW w:type="dxa" w:w="1680"/>
-            <w:tcBorders>
-              <w:top w:val="single" w:sz="4" w:space="0" w:color="CCCCCC"/>
-              <w:bottom w:val="single" w:sz="4" w:space="0" w:color="CCCCCC"/>
-              <w:left w:val="single" w:sz="4" w:space="0" w:color="CCCCCC"/>
-              <w:right w:val="single" w:sz="4" w:space="0" w:color="CCCCCC"/>
-            </w:tcBorders>
-          </w:tcPr>
-          <w:p>
-            <w:r>
-              <w:rPr>
-                <w:color w:val="333333"/>
-                <w:sz w:val="18"/>
-              </w:rPr>
-              <w:t>CVE-2017-14622</w:t>
-            </w:r>
-          </w:p>
-        </w:tc>
-        <w:tc>
-          <w:tcPr>
-            <w:tcW w:type="dxa" w:w="1680"/>
-            <w:tcBorders>
-              <w:top w:val="single" w:sz="4" w:space="0" w:color="CCCCCC"/>
-              <w:bottom w:val="single" w:sz="4" w:space="0" w:color="CCCCCC"/>
-              <w:left w:val="single" w:sz="4" w:space="0" w:color="CCCCCC"/>
-              <w:right w:val="single" w:sz="4" w:space="0" w:color="CCCCCC"/>
-            </w:tcBorders>
-          </w:tcPr>
-          <w:p>
-            <w:r>
-              <w:rPr>
-                <w:color w:val="333333"/>
-                <w:sz w:val="18"/>
-              </w:rPr>
-              <w:t>WordPress Plugin: 2kb-amazon-affiliates-store</w:t>
-            </w:r>
-          </w:p>
-        </w:tc>
-        <w:tc>
-          <w:tcPr>
-            <w:tcW w:type="dxa" w:w="1680"/>
-            <w:tcBorders>
-              <w:top w:val="single" w:sz="4" w:space="0" w:color="CCCCCC"/>
-              <w:bottom w:val="single" w:sz="4" w:space="0" w:color="CCCCCC"/>
-              <w:left w:val="single" w:sz="4" w:space="0" w:color="CCCCCC"/>
-              <w:right w:val="single" w:sz="4" w:space="0" w:color="CCCCCC"/>
-            </w:tcBorders>
-          </w:tcPr>
-          <w:p>
-            <w:r>
-              <w:rPr>
-                <w:color w:val="333333"/>
-                <w:sz w:val="18"/>
-              </w:rPr>
-              <w:t>1 system</w:t>
-            </w:r>
-          </w:p>
-        </w:tc>
-        <w:tc>
-          <w:tcPr>
-            <w:tcW w:type="dxa" w:w="1680"/>
-            <w:shd w:fill="E8F5E9" w:val="clear" w:color="auto"/>
-            <w:tcBorders>
-              <w:top w:val="single" w:sz="4" w:space="0" w:color="CCCCCC"/>
-              <w:bottom w:val="single" w:sz="4" w:space="0" w:color="CCCCCC"/>
-              <w:left w:val="single" w:sz="4" w:space="0" w:color="CCCCCC"/>
-              <w:right w:val="single" w:sz="4" w:space="0" w:color="CCCCCC"/>
-            </w:tcBorders>
-          </w:tcPr>
-          <w:p>
-            <w:r>
-              <w:rPr>
-                <w:color w:val="333333"/>
-                <w:sz w:val="18"/>
-              </w:rPr>
-              <w:t>None known</w:t>
+              <w:t>Minimal exploit probability (EPSS 0.18%)</w:t>
             </w:r>
           </w:p>
         </w:tc>
@@ -1682,7 +1550,7 @@
         <w:tc>
           <w:tcPr>
             <w:tcW w:type="dxa" w:w="1680"/>
-            <w:shd w:fill="E8F5E9" w:val="clear" w:color="auto"/>
+            <w:shd w:fill="FFEBEE" w:val="clear" w:color="auto"/>
             <w:tcBorders>
               <w:top w:val="single" w:sz="4" w:space="0" w:color="CCCCCC"/>
               <w:bottom w:val="single" w:sz="4" w:space="0" w:color="CCCCCC"/>
@@ -1696,7 +1564,7 @@
                 <w:color w:val="333333"/>
                 <w:sz w:val="18"/>
               </w:rPr>
-              <w:t>None known</w:t>
+              <w:t>Minimal exploit probability (EPSS 0.69%)</w:t>
             </w:r>
           </w:p>
         </w:tc>
@@ -1767,7 +1635,7 @@
                 <w:color w:val="333333"/>
                 <w:sz w:val="18"/>
               </w:rPr>
-              <w:t>CVE-2024-13555</w:t>
+              <w:t>CVE-2022-45368</w:t>
             </w:r>
           </w:p>
         </w:tc>
@@ -1787,7 +1655,7 @@
                 <w:color w:val="333333"/>
                 <w:sz w:val="18"/>
               </w:rPr>
-              <w:t>WordPress Plugin: 1-click-migration</w:t>
+              <w:t>WordPress Plugin: 1003-mortgage-application</w:t>
             </w:r>
           </w:p>
         </w:tc>
@@ -1814,7 +1682,7 @@
         <w:tc>
           <w:tcPr>
             <w:tcW w:type="dxa" w:w="1680"/>
-            <w:shd w:fill="E8F5E9" w:val="clear" w:color="auto"/>
+            <w:shd w:fill="FFEBEE" w:val="clear" w:color="auto"/>
             <w:tcBorders>
               <w:top w:val="single" w:sz="4" w:space="0" w:color="CCCCCC"/>
               <w:bottom w:val="single" w:sz="4" w:space="0" w:color="CCCCCC"/>
@@ -1828,7 +1696,7 @@
                 <w:color w:val="333333"/>
                 <w:sz w:val="18"/>
               </w:rPr>
-              <w:t>None known</w:t>
+              <w:t>Minimal exploit probability (EPSS 0.73%)</w:t>
             </w:r>
           </w:p>
         </w:tc>
@@ -1877,7 +1745,7 @@
                 <w:color w:val="333333"/>
                 <w:sz w:val="18"/>
               </w:rPr>
-              <w:t>24</w:t>
+              <w:t>49</w:t>
             </w:r>
           </w:p>
         </w:tc>
@@ -1899,7 +1767,7 @@
                 <w:color w:val="333333"/>
                 <w:sz w:val="18"/>
               </w:rPr>
-              <w:t>CVE-2024-13609</w:t>
+              <w:t>CVE-2023-49173</w:t>
             </w:r>
           </w:p>
         </w:tc>
@@ -1919,7 +1787,7 @@
                 <w:color w:val="333333"/>
                 <w:sz w:val="18"/>
               </w:rPr>
-              <w:t>WordPress Plugin: 1-click-migration</w:t>
+              <w:t>WordPress Plugin: 10to8-online-booking</w:t>
             </w:r>
           </w:p>
         </w:tc>
@@ -1946,7 +1814,7 @@
         <w:tc>
           <w:tcPr>
             <w:tcW w:type="dxa" w:w="1680"/>
-            <w:shd w:fill="E8F5E9" w:val="clear" w:color="auto"/>
+            <w:shd w:fill="FFEBEE" w:val="clear" w:color="auto"/>
             <w:tcBorders>
               <w:top w:val="single" w:sz="4" w:space="0" w:color="CCCCCC"/>
               <w:bottom w:val="single" w:sz="4" w:space="0" w:color="CCCCCC"/>
@@ -1960,7 +1828,7 @@
                 <w:color w:val="333333"/>
                 <w:sz w:val="18"/>
               </w:rPr>
-              <w:t>None known</w:t>
+              <w:t>Minimal exploit probability (EPSS 0.18%)</w:t>
             </w:r>
           </w:p>
         </w:tc>
@@ -2009,7 +1877,139 @@
                 <w:color w:val="333333"/>
                 <w:sz w:val="18"/>
               </w:rPr>
-              <w:t>24</w:t>
+              <w:t>8</w:t>
+            </w:r>
+          </w:p>
+        </w:tc>
+      </w:tr>
+      <w:tr>
+        <w:tc>
+          <w:tcPr>
+            <w:tcW w:type="dxa" w:w="1680"/>
+            <w:tcBorders>
+              <w:top w:val="single" w:sz="4" w:space="0" w:color="CCCCCC"/>
+              <w:bottom w:val="single" w:sz="4" w:space="0" w:color="CCCCCC"/>
+              <w:left w:val="single" w:sz="4" w:space="0" w:color="CCCCCC"/>
+              <w:right w:val="single" w:sz="4" w:space="0" w:color="CCCCCC"/>
+            </w:tcBorders>
+          </w:tcPr>
+          <w:p>
+            <w:r>
+              <w:rPr>
+                <w:color w:val="333333"/>
+                <w:sz w:val="18"/>
+              </w:rPr>
+              <w:t>CVE-2023-46641</w:t>
+            </w:r>
+          </w:p>
+        </w:tc>
+        <w:tc>
+          <w:tcPr>
+            <w:tcW w:type="dxa" w:w="1680"/>
+            <w:tcBorders>
+              <w:top w:val="single" w:sz="4" w:space="0" w:color="CCCCCC"/>
+              <w:bottom w:val="single" w:sz="4" w:space="0" w:color="CCCCCC"/>
+              <w:left w:val="single" w:sz="4" w:space="0" w:color="CCCCCC"/>
+              <w:right w:val="single" w:sz="4" w:space="0" w:color="CCCCCC"/>
+            </w:tcBorders>
+          </w:tcPr>
+          <w:p>
+            <w:r>
+              <w:rPr>
+                <w:color w:val="333333"/>
+                <w:sz w:val="18"/>
+              </w:rPr>
+              <w:t>WordPress Plugin: 12-step-meeting-list</w:t>
+            </w:r>
+          </w:p>
+        </w:tc>
+        <w:tc>
+          <w:tcPr>
+            <w:tcW w:type="dxa" w:w="1680"/>
+            <w:tcBorders>
+              <w:top w:val="single" w:sz="4" w:space="0" w:color="CCCCCC"/>
+              <w:bottom w:val="single" w:sz="4" w:space="0" w:color="CCCCCC"/>
+              <w:left w:val="single" w:sz="4" w:space="0" w:color="CCCCCC"/>
+              <w:right w:val="single" w:sz="4" w:space="0" w:color="CCCCCC"/>
+            </w:tcBorders>
+          </w:tcPr>
+          <w:p>
+            <w:r>
+              <w:rPr>
+                <w:color w:val="333333"/>
+                <w:sz w:val="18"/>
+              </w:rPr>
+              <w:t>1 system</w:t>
+            </w:r>
+          </w:p>
+        </w:tc>
+        <w:tc>
+          <w:tcPr>
+            <w:tcW w:type="dxa" w:w="1680"/>
+            <w:shd w:fill="FFEBEE" w:val="clear" w:color="auto"/>
+            <w:tcBorders>
+              <w:top w:val="single" w:sz="4" w:space="0" w:color="CCCCCC"/>
+              <w:bottom w:val="single" w:sz="4" w:space="0" w:color="CCCCCC"/>
+              <w:left w:val="single" w:sz="4" w:space="0" w:color="CCCCCC"/>
+              <w:right w:val="single" w:sz="4" w:space="0" w:color="CCCCCC"/>
+            </w:tcBorders>
+          </w:tcPr>
+          <w:p>
+            <w:r>
+              <w:rPr>
+                <w:color w:val="333333"/>
+                <w:sz w:val="18"/>
+              </w:rPr>
+              <w:t>Minimal exploit probability (EPSS 0.19%)</w:t>
+            </w:r>
+          </w:p>
+        </w:tc>
+        <w:tc>
+          <w:tcPr>
+            <w:tcW w:type="dxa" w:w="1680"/>
+            <w:shd w:fill="E8F5E9" w:val="clear" w:color="auto"/>
+            <w:tcBorders>
+              <w:top w:val="single" w:sz="4" w:space="0" w:color="CCCCCC"/>
+              <w:bottom w:val="single" w:sz="4" w:space="0" w:color="CCCCCC"/>
+              <w:left w:val="single" w:sz="4" w:space="0" w:color="CCCCCC"/>
+              <w:right w:val="single" w:sz="4" w:space="0" w:color="CCCCCC"/>
+            </w:tcBorders>
+          </w:tcPr>
+          <w:p>
+            <w:pPr>
+              <w:jc w:val="center"/>
+            </w:pPr>
+            <w:r>
+              <w:rPr>
+                <w:b/>
+                <w:color w:val="333333"/>
+                <w:sz w:val="18"/>
+              </w:rPr>
+              <w:t>P3</w:t>
+            </w:r>
+          </w:p>
+        </w:tc>
+        <w:tc>
+          <w:tcPr>
+            <w:tcW w:type="dxa" w:w="1680"/>
+            <w:shd w:fill="FFEBEE" w:val="clear" w:color="auto"/>
+            <w:tcBorders>
+              <w:top w:val="single" w:sz="4" w:space="0" w:color="CCCCCC"/>
+              <w:bottom w:val="single" w:sz="4" w:space="0" w:color="CCCCCC"/>
+              <w:left w:val="single" w:sz="4" w:space="0" w:color="CCCCCC"/>
+              <w:right w:val="single" w:sz="4" w:space="0" w:color="CCCCCC"/>
+            </w:tcBorders>
+          </w:tcPr>
+          <w:p>
+            <w:pPr>
+              <w:jc w:val="center"/>
+            </w:pPr>
+            <w:r>
+              <w:rPr>
+                <w:color w:val="333333"/>
+                <w:sz w:val="18"/>
+              </w:rPr>
+              <w:t>49</w:t>
             </w:r>
           </w:p>
         </w:tc>
@@ -2193,7 +2193,7 @@
                 <w:color w:val="333333"/>
                 <w:sz w:val="18"/>
               </w:rPr>
-              <w:t>Monitor for suspicious file encryption activity, unauthorized access attempts, and lateral movement within manufacturing and healthcare networks.</w:t>
+              <w:t>Monitor for ransomware activity, suspicious file encryption, and extortion attempts. Watch for unauthorized lateral movement.</w:t>
             </w:r>
           </w:p>
         </w:tc>
@@ -2259,7 +2259,7 @@
                 <w:color w:val="333333"/>
                 <w:sz w:val="18"/>
               </w:rPr>
-              <w:t>Monitor for credential harvesting, suspicious outbound connections, and unauthorized access to laboratory systems.</w:t>
+              <w:t>Monitor for credential harvesting, unusual outbound traffic, and unauthorized access to sensitive data.</w:t>
             </w:r>
           </w:p>
         </w:tc>
@@ -2282,9 +2282,9 @@
                 <w:color w:val="333333"/>
                 <w:sz w:val="18"/>
               </w:rPr>
-              <w:t>North Korea</w:t>
+              <w:t>Unknown</w:t>
               <w:br/>
-              <w:t>State-Sponsored</w:t>
+              <w:t>Criminal</w:t>
             </w:r>
           </w:p>
         </w:tc>
@@ -2304,7 +2304,7 @@
                 <w:color w:val="333333"/>
                 <w:sz w:val="18"/>
               </w:rPr>
-              <w:t>RICOCHET CHOLLIMA</w:t>
+              <w:t>HOOK SPIDER</w:t>
             </w:r>
           </w:p>
         </w:tc>
@@ -2325,7 +2325,7 @@
                 <w:color w:val="333333"/>
                 <w:sz w:val="18"/>
               </w:rPr>
-              <w:t>Monitor for spear phishing, unusual file transfers, and connections to North Korean infrastructure.</w:t>
+              <w:t>Monitor for supply chain compromise, abnormal device behavior, and phishing attempts.</w:t>
             </w:r>
           </w:p>
         </w:tc>
@@ -2391,7 +2391,73 @@
                 <w:color w:val="333333"/>
                 <w:sz w:val="18"/>
               </w:rPr>
-              <w:t>Monitor for PowerShell activity, credential harvesting, and unauthorized access to laboratory equipment.</w:t>
+              <w:t>Monitor for PowerShell activity, suspicious connections to Middle East regions, and credential harvesting.</w:t>
+            </w:r>
+          </w:p>
+        </w:tc>
+      </w:tr>
+      <w:tr>
+        <w:tc>
+          <w:tcPr>
+            <w:tcW w:type="dxa" w:w="3360"/>
+            <w:shd w:fill="F5F5F5" w:val="clear" w:color="auto"/>
+            <w:tcBorders>
+              <w:top w:val="single" w:sz="4" w:space="0" w:color="CCCCCC"/>
+              <w:bottom w:val="single" w:sz="4" w:space="0" w:color="CCCCCC"/>
+              <w:left w:val="single" w:sz="4" w:space="0" w:color="CCCCCC"/>
+              <w:right w:val="single" w:sz="4" w:space="0" w:color="CCCCCC"/>
+            </w:tcBorders>
+          </w:tcPr>
+          <w:p>
+            <w:r>
+              <w:rPr>
+                <w:color w:val="333333"/>
+                <w:sz w:val="18"/>
+              </w:rPr>
+              <w:t>China</w:t>
+              <w:br/>
+              <w:t>State-Sponsored</w:t>
+            </w:r>
+          </w:p>
+        </w:tc>
+        <w:tc>
+          <w:tcPr>
+            <w:tcW w:type="dxa" w:w="3360"/>
+            <w:tcBorders>
+              <w:top w:val="single" w:sz="4" w:space="0" w:color="CCCCCC"/>
+              <w:bottom w:val="single" w:sz="4" w:space="0" w:color="CCCCCC"/>
+              <w:left w:val="single" w:sz="4" w:space="0" w:color="CCCCCC"/>
+              <w:right w:val="single" w:sz="4" w:space="0" w:color="CCCCCC"/>
+            </w:tcBorders>
+          </w:tcPr>
+          <w:p>
+            <w:r>
+              <w:rPr>
+                <w:color w:val="333333"/>
+                <w:sz w:val="18"/>
+              </w:rPr>
+              <w:t>CASCADE PANDA</w:t>
+            </w:r>
+          </w:p>
+        </w:tc>
+        <w:tc>
+          <w:tcPr>
+            <w:tcW w:type="dxa" w:w="3360"/>
+            <w:shd w:fill="E3F2FD" w:val="clear" w:color="auto"/>
+            <w:tcBorders>
+              <w:top w:val="single" w:sz="4" w:space="0" w:color="CCCCCC"/>
+              <w:bottom w:val="single" w:sz="4" w:space="0" w:color="CCCCCC"/>
+              <w:left w:val="single" w:sz="4" w:space="0" w:color="CCCCCC"/>
+              <w:right w:val="single" w:sz="4" w:space="0" w:color="CCCCCC"/>
+            </w:tcBorders>
+          </w:tcPr>
+          <w:p>
+            <w:r>
+              <w:rPr>
+                <w:color w:val="333333"/>
+                <w:sz w:val="18"/>
+              </w:rPr>
+              <w:t>Monitor for data exfiltration, unauthorized access to research databases, and spear phishing.</w:t>
             </w:r>
           </w:p>
         </w:tc>
@@ -2420,7 +2486,7 @@
           <w:b/>
           <w:sz w:val="20"/>
         </w:rPr>
-        <w:t>CVE-2023-33999 (WordPress Plugin: 2mb-autocode): High-severity vulnerability detected on seven systems. May allow unauthorized access or code execution depending on affected product.</w:t>
+        <w:t>CVE-2023-33999 (WordPress Plugin: 2mb-autocode): High-severity vulnerability present on multiple systems. Details not specified but likely impacts core infrastructure.</w:t>
       </w:r>
     </w:p>
     <w:p>
@@ -2432,7 +2498,7 @@
           <w:b/>
           <w:sz w:val="20"/>
         </w:rPr>
-        <w:t>CVE-2021-39317 (WordPress Plugin: access-demo-importer): High-severity vulnerability detected on seven systems. May impact web applications or laboratory management software.</w:t>
+        <w:t>CVE-2021-39317 (WordPress Plugin: access-demo-importer): High-severity vulnerability affecting multiple systems. May impact web applications or IoT devices.</w:t>
       </w:r>
     </w:p>
     <w:p>
@@ -2444,7 +2510,7 @@
           <w:b/>
           <w:sz w:val="20"/>
         </w:rPr>
-        <w:t>CVE-2022-23975 (WordPress Plugin: access-demo-importer): High-severity vulnerability detected on seven systems. May allow privilege escalation or data exposure.</w:t>
+        <w:t>CVE-2022-23975 (WordPress Plugin: access-demo-importer): High-severity vulnerability detected on several systems. Details not specified.</w:t>
       </w:r>
     </w:p>
     <w:p>
@@ -2456,7 +2522,7 @@
           <w:b/>
           <w:sz w:val="20"/>
         </w:rPr>
-        <w:t>CVE-2022-4974 (WordPress Plugin: 3d-viewer): High-severity vulnerability detected on six systems. May affect networked devices or laboratory management platforms.</w:t>
+        <w:t>CVE-2022-4974 (WordPress Plugin: 3d-viewer): High-severity vulnerability detected on 6 systems. May impact network or device security.</w:t>
       </w:r>
     </w:p>
     <w:p>
@@ -2468,7 +2534,7 @@
           <w:b/>
           <w:sz w:val="20"/>
         </w:rPr>
-        <w:t>CVE-2022-23976 (WordPress Plugin: access-demo-importer): High-severity vulnerability detected on one system. May impact device or application security.</w:t>
+        <w:t>CVE-2022-23976 (WordPress Plugin: access-demo-importer): High-severity vulnerability detected on a single system.</w:t>
       </w:r>
     </w:p>
     <w:p/>
@@ -2493,7 +2559,7 @@
         <w:rPr>
           <w:sz w:val="20"/>
         </w:rPr>
-        <w:t>Patch all high-severity vulnerabilities detected on five or more systems within seven days, prioritizing CVE-2023-33999, CVE-2021-39317, and CVE-2022-23975.</w:t>
+        <w:t>Prioritize patching of CVE-2023-33999, CVE-2021-39317, and CVE-2022-23975 across all affected systems within 7-14 days to reduce risk of lateral movement and data compromise.</w:t>
       </w:r>
     </w:p>
     <w:p>
@@ -2504,7 +2570,7 @@
         <w:rPr>
           <w:sz w:val="20"/>
         </w:rPr>
-        <w:t>Review and update legacy systems and laboratory IoT devices for vulnerabilities such as CVE-2012-4272 and CVE-2017-14622 to ensure compliance with HIPAA and FDA regulations.</w:t>
+        <w:t>Conduct targeted vulnerability scans and asset inventory to verify exposure and ensure no additional systems are impacted by high-severity CVEs.</w:t>
       </w:r>
     </w:p>
     <w:p>
@@ -2515,7 +2581,7 @@
         <w:rPr>
           <w:sz w:val="20"/>
         </w:rPr>
-        <w:t>Enhance monitoring for ransomware and extortion activity, especially in manufacturing and healthcare networks, based on CrowdStrike APT targeting trends.</w:t>
+        <w:t>Enhance monitoring for ransomware, extortion, and supply chain compromise indicators as highlighted by CrowdStrike and OSINT sources.</w:t>
       </w:r>
     </w:p>
     <w:p>
@@ -2526,7 +2592,7 @@
         <w:rPr>
           <w:sz w:val="20"/>
         </w:rPr>
-        <w:t>Implement network segmentation and access controls to limit lateral movement and reduce risk of data exposure.</w:t>
+        <w:t>Review access controls and authentication mechanisms for laboratory equipment, IoT devices, and healthcare systems to mitigate risk from opportunistic and targeted actors.</w:t>
       </w:r>
     </w:p>
     <w:p>
@@ -2537,7 +2603,7 @@
         <w:rPr>
           <w:sz w:val="20"/>
         </w:rPr>
-        <w:t>Monitor for AI-powered phishing and extortion campaigns as highlighted in OSINT sources, and provide targeted user awareness training.</w:t>
+        <w:t>Engage supply chain partners and vendors to confirm their patching status and security posture, especially for devices and software linked to detected CVEs.</w:t>
       </w:r>
     </w:p>
     <w:p/>

</xml_diff>